<commit_message>
Add student name and ID to final report
</commit_message>
<xml_diff>
--- a/reports/final_report.docx
+++ b/reports/final_report.docx
@@ -139,7 +139,7 @@
                 <w:sz w:val="19"/>
                 <w:szCs w:val="19"/>
               </w:rPr>
-              <w:t xml:space="preserve">[Your full name]</w:t>
+              <w:t xml:space="preserve">Subham Kumar</w:t>
             </w:r>
           </w:p>
         </w:tc>
@@ -188,7 +188,7 @@
                 <w:sz w:val="19"/>
                 <w:szCs w:val="19"/>
               </w:rPr>
-              <w:t xml:space="preserve">[Your BITS ID]</w:t>
+              <w:t xml:space="preserve">2025ae05779</w:t>
             </w:r>
           </w:p>
         </w:tc>
@@ -1707,7 +1707,7 @@
       <w:r>
         <w:t xml:space="preserve">The Cleveland subset of the </w:t>
       </w:r>
-      <w:hyperlink w:history="1" r:id="rIdcvuhcy6cihjs9khjjwkck">
+      <w:hyperlink w:history="1" r:id="rIdyxvnjmqkxmsfrllmiioaa">
         <w:r>
           <w:rPr>
             <w:rStyle w:val="Hyperlink"/>
@@ -5999,7 +5999,7 @@
       <w:r>
         <w:t xml:space="preserve">Repository: </w:t>
       </w:r>
-      <w:hyperlink w:history="1" r:id="rId1nsgsk3xvayuyg7wijllw">
+      <w:hyperlink w:history="1" r:id="rIddobhmsqay90uykqvxjpzd">
         <w:r>
           <w:rPr>
             <w:rStyle w:val="Hyperlink"/>
@@ -6010,7 +6010,7 @@
       <w:r>
         <w:t xml:space="preserve">. Dataset: </w:t>
       </w:r>
-      <w:hyperlink w:history="1" r:id="rIdlaqsbq4_glk1mdeg5j_-7">
+      <w:hyperlink w:history="1" r:id="rIdzwmn7slq2uaggyopmnegd">
         <w:r>
           <w:rPr>
             <w:rStyle w:val="Hyperlink"/>

</xml_diff>